<commit_message>
Ignore Office documents in license header scan and restore user manual cover
</commit_message>
<xml_diff>
--- a/docs/00-ZX-UX_User_Manual_Revision_13.docx
+++ b/docs/00-ZX-UX_User_Manual_Revision_13.docx
@@ -90,7 +90,7 @@
           </w:tcPr>
           <w:p>
             <w:r>
-              <w:t>Revision 17</w:t>
+              <w:t>Revision 12</w:t>
             </w:r>
           </w:p>
         </w:tc>
@@ -172,7 +172,7 @@
           </w:tcPr>
           <w:p>
             <w:r>
-              <w:t>bd9f1dec7423f89dbf80e736de8197e0360424f9</w:t>
+              <w:t>56f509189de369038258cca0f61ae0f59ddd4a04</w:t>
             </w:r>
           </w:p>
         </w:tc>
@@ -213,7 +213,7 @@
           </w:tcPr>
           <w:p>
             <w:r>
-              <w:t>27 September 2026</w:t>
+              <w:t>16 September 2026</w:t>
             </w:r>
           </w:p>
         </w:tc>
@@ -237,7 +237,11 @@
         <w:jc w:val="center"/>
       </w:pPr>
       <w:r>
-        <w:t>Derived from docs/01-ZX-UX-ARCHITECTURE-REV17.md and the completed Phase-11 user-facing implementation documentation.</w:t>
+        <w:rPr>
+          <w:color w:val="5F5F5F"/>
+          <w:sz w:val="17"/>
+        </w:rPr>
+        <w:t>Derived from docs/01-ZX-UX-ARCHITECTURE-REV12.md.</w:t>
       </w:r>
     </w:p>
     <w:p>
@@ -12128,9 +12132,12 @@
     <w:sectPr>
       <w:footerReference w:type="default" r:id="rId9"/>
       <w:headerReference w:type="default" r:id="rId10"/>
+      <w:headerReference w:type="first" r:id="rId11"/>
+      <w:footerReference w:type="first" r:id="rId12"/>
       <w:pgSz w:w="12240" w:h="15840"/>
       <w:pgMar w:top="1037" w:right="1123" w:bottom="1037" w:left="1123" w:header="720" w:footer="720" w:gutter="0"/>
       <w:cols w:space="720"/>
+      <w:titlePg/>
       <w:docGrid w:linePitch="360"/>
     </w:sectPr>
   </w:body>
@@ -12151,6 +12158,23 @@
 </w:ftr>
 </file>
 
+<file path=word/footer2.xml><?xml version="1.0" encoding="utf-8"?>
+<w:ftr xmlns:m="http://schemas.openxmlformats.org/officeDocument/2006/math" xmlns:mc="http://schemas.openxmlformats.org/markup-compatibility/2006" xmlns:mo="http://schemas.microsoft.com/office/mac/office/2008/main" xmlns:mv="urn:schemas-microsoft-com:mac:vml" xmlns:o="urn:schemas-microsoft-com:office:office" xmlns:r="http://schemas.openxmlformats.org/officeDocument/2006/relationships" xmlns:v="urn:schemas-microsoft-com:vml" xmlns:w10="urn:schemas-microsoft-com:office:word" xmlns:w14="http://schemas.microsoft.com/office/word/2010/wordml" xmlns:w="http://schemas.openxmlformats.org/wordprocessingml/2006/main" xmlns:wne="http://schemas.microsoft.com/office/word/2006/wordml" xmlns:wp14="http://schemas.microsoft.com/office/word/2010/wordprocessingDrawing" xmlns:wp="http://schemas.openxmlformats.org/drawingml/2006/wordprocessingDrawing" xmlns:wpc="http://schemas.microsoft.com/office/word/2010/wordprocessingCanvas" xmlns:wpg="http://schemas.microsoft.com/office/word/2010/wordprocessingGroup" xmlns:wpi="http://schemas.microsoft.com/office/word/2010/wordprocessingInk" xmlns:wps="http://schemas.microsoft.com/office/word/2010/wordprocessingShape" mc:Ignorable="w14 wp14">
+  <w:p>
+    <w:pPr>
+      <w:pStyle w:val="Small"/>
+      <w:jc w:val="center"/>
+    </w:pPr>
+    <w:r>
+      <w:t xml:space="preserve">ZX-UX User Manual - Revision 12  |  </w:t>
+      <w:fldChar w:fldCharType="begin"/>
+      <w:instrText xml:space="preserve"> PAGE </w:instrText>
+      <w:fldChar w:fldCharType="end"/>
+    </w:r>
+  </w:p>
+</w:ftr>
+</file>
+
 <file path=word/header1.xml><?xml version="1.0" encoding="utf-8"?>
 <w:hdr xmlns:m="http://schemas.openxmlformats.org/officeDocument/2006/math" xmlns:mc="http://schemas.openxmlformats.org/markup-compatibility/2006" xmlns:mo="http://schemas.microsoft.com/office/mac/office/2008/main" xmlns:mv="urn:schemas-microsoft-com:mac:vml" xmlns:o="urn:schemas-microsoft-com:office:office" xmlns:r="http://schemas.openxmlformats.org/officeDocument/2006/relationships" xmlns:v="urn:schemas-microsoft-com:vml" xmlns:w10="urn:schemas-microsoft-com:office:word" xmlns:w14="http://schemas.microsoft.com/office/word/2010/wordml" xmlns:w="http://schemas.openxmlformats.org/wordprocessingml/2006/main" xmlns:wne="http://schemas.microsoft.com/office/word/2006/wordml" xmlns:wp14="http://schemas.microsoft.com/office/word/2010/wordprocessingDrawing" xmlns:wp="http://schemas.openxmlformats.org/drawingml/2006/wordprocessingDrawing" xmlns:wpc="http://schemas.microsoft.com/office/word/2010/wordprocessingCanvas" xmlns:wpg="http://schemas.microsoft.com/office/word/2010/wordprocessingGroup" xmlns:wpi="http://schemas.microsoft.com/office/word/2010/wordprocessingInk" xmlns:wps="http://schemas.microsoft.com/office/word/2010/wordprocessingShape" mc:Ignorable="w14 wp14">
   <w:p>
@@ -12165,6 +12189,25 @@
         <w:sz w:val="16"/>
       </w:rPr>
       <w:t>ZX-UX  |  User Manual  |  Rev. 13</w:t>
+    </w:r>
+  </w:p>
+</w:hdr>
+</file>
+
+<file path=word/header2.xml><?xml version="1.0" encoding="utf-8"?>
+<w:hdr xmlns:m="http://schemas.openxmlformats.org/officeDocument/2006/math" xmlns:mc="http://schemas.openxmlformats.org/markup-compatibility/2006" xmlns:mo="http://schemas.microsoft.com/office/mac/office/2008/main" xmlns:mv="urn:schemas-microsoft-com:mac:vml" xmlns:o="urn:schemas-microsoft-com:office:office" xmlns:r="http://schemas.openxmlformats.org/officeDocument/2006/relationships" xmlns:v="urn:schemas-microsoft-com:vml" xmlns:w10="urn:schemas-microsoft-com:office:word" xmlns:w14="http://schemas.microsoft.com/office/word/2010/wordml" xmlns:w="http://schemas.openxmlformats.org/wordprocessingml/2006/main" xmlns:wne="http://schemas.microsoft.com/office/word/2006/wordml" xmlns:wp14="http://schemas.microsoft.com/office/word/2010/wordprocessingDrawing" xmlns:wp="http://schemas.openxmlformats.org/drawingml/2006/wordprocessingDrawing" xmlns:wpc="http://schemas.microsoft.com/office/word/2010/wordprocessingCanvas" xmlns:wpg="http://schemas.microsoft.com/office/word/2010/wordprocessingGroup" xmlns:wpi="http://schemas.microsoft.com/office/word/2010/wordprocessingInk" xmlns:wps="http://schemas.microsoft.com/office/word/2010/wordprocessingShape" mc:Ignorable="w14 wp14">
+  <w:p>
+    <w:pPr>
+      <w:pStyle w:val="Header"/>
+      <w:jc w:val="right"/>
+    </w:pPr>
+    <w:r>
+      <w:rPr>
+        <w:rFonts w:ascii="Aptos" w:hAnsi="Aptos"/>
+        <w:color w:val="646464"/>
+        <w:sz w:val="16"/>
+      </w:rPr>
+      <w:t>ZX-UX  |  User Manual  |  Rev. 12</w:t>
     </w:r>
   </w:p>
 </w:hdr>

</xml_diff>

<commit_message>
Restore graphical Rev-12 cover in User Manual Rev 13
</commit_message>
<xml_diff>
--- a/docs/00-ZX-UX_User_Manual_Revision_13.docx
+++ b/docs/00-ZX-UX_User_Manual_Revision_13.docx
@@ -4,248 +4,42 @@
   <w:body>
     <w:p>
       <w:pPr>
-        <w:spacing w:before="1500"/>
+        <w:spacing w:before="0" w:after="0"/>
         <w:jc w:val="center"/>
       </w:pPr>
       <w:r>
-        <w:rPr>
-          <w:rFonts w:ascii="Aptos Display" w:hAnsi="Aptos Display"/>
-          <w:b/>
-          <w:color w:val="1F4E79"/>
-          <w:sz w:val="72"/>
-        </w:rPr>
-        <w:t>ZX-UX</w:t>
-      </w:r>
-    </w:p>
-    <w:p>
-      <w:pPr>
-        <w:jc w:val="center"/>
-      </w:pPr>
-      <w:r>
-        <w:rPr>
-          <w:b/>
-          <w:color w:val="333333"/>
-          <w:sz w:val="44"/>
-        </w:rPr>
-        <w:t>USER MANUAL</w:t>
-      </w:r>
-    </w:p>
-    <w:p>
-      <w:pPr>
-        <w:jc w:val="center"/>
-      </w:pPr>
-      <w:r>
-        <w:rPr>
-          <w:i/>
-          <w:sz w:val="26"/>
-        </w:rPr>
-        <w:t>For the Sinclair ZX Spectrum 48K Unix-Like Environment</w:t>
-      </w:r>
-    </w:p>
-    <w:p/>
-    <w:tbl>
-      <w:tblPr>
-        <w:tblStyle w:val="TableGrid"/>
-        <w:tblW w:type="auto" w:w="0"/>
-        <w:jc w:val="center"/>
-        <w:tblLook w:firstColumn="1" w:firstRow="1" w:lastColumn="0" w:lastRow="0" w:noHBand="0" w:noVBand="1" w:val="04A0"/>
-      </w:tblPr>
-      <w:tblGrid>
-        <w:gridCol w:w="4997"/>
-        <w:gridCol w:w="4997"/>
-      </w:tblGrid>
-      <w:tr>
-        <w:trPr>
-          <w:cantSplit/>
-        </w:trPr>
-        <w:tc>
-          <w:tcPr>
-            <w:tcW w:type="dxa" w:w="4997"/>
-            <w:shd w:fill="EAF2F8"/>
-            <w:tcMar>
-              <w:top w:w="70" w:type="dxa"/>
-              <w:start w:w="90" w:type="dxa"/>
-              <w:bottom w:w="70" w:type="dxa"/>
-              <w:end w:w="90" w:type="dxa"/>
-            </w:tcMar>
-          </w:tcPr>
-          <w:p>
-            <w:r>
-              <w:rPr>
-                <w:b/>
-              </w:rPr>
-              <w:t>Architecture baseline</w:t>
-            </w:r>
-          </w:p>
-        </w:tc>
-        <w:tc>
-          <w:tcPr>
-            <w:tcW w:type="dxa" w:w="4997"/>
-            <w:tcMar>
-              <w:top w:w="70" w:type="dxa"/>
-              <w:start w:w="90" w:type="dxa"/>
-              <w:bottom w:w="70" w:type="dxa"/>
-              <w:end w:w="90" w:type="dxa"/>
-            </w:tcMar>
-          </w:tcPr>
-          <w:p>
-            <w:r>
-              <w:t>Revision 12</w:t>
-            </w:r>
-          </w:p>
-        </w:tc>
-      </w:tr>
-      <w:tr>
-        <w:trPr>
-          <w:cantSplit/>
-        </w:trPr>
-        <w:tc>
-          <w:tcPr>
-            <w:tcW w:type="dxa" w:w="4997"/>
-            <w:shd w:fill="EAF2F8"/>
-            <w:tcMar>
-              <w:top w:w="70" w:type="dxa"/>
-              <w:start w:w="90" w:type="dxa"/>
-              <w:bottom w:w="70" w:type="dxa"/>
-              <w:end w:w="90" w:type="dxa"/>
-            </w:tcMar>
-          </w:tcPr>
-          <w:p>
-            <w:r>
-              <w:rPr>
-                <w:b/>
-              </w:rPr>
-              <w:t>Target</w:t>
-            </w:r>
-          </w:p>
-        </w:tc>
-        <w:tc>
-          <w:tcPr>
-            <w:tcW w:type="dxa" w:w="4997"/>
-            <w:tcMar>
-              <w:top w:w="70" w:type="dxa"/>
-              <w:start w:w="90" w:type="dxa"/>
-              <w:bottom w:w="70" w:type="dxa"/>
-              <w:end w:w="90" w:type="dxa"/>
-            </w:tcMar>
-          </w:tcPr>
-          <w:p>
-            <w:r>
-              <w:t>Original 48K ZX Spectrum, unexpanded RAM</w:t>
-            </w:r>
-          </w:p>
-        </w:tc>
-      </w:tr>
-      <w:tr>
-        <w:trPr>
-          <w:cantSplit/>
-        </w:trPr>
-        <w:tc>
-          <w:tcPr>
-            <w:tcW w:type="dxa" w:w="4997"/>
-            <w:shd w:fill="EAF2F8"/>
-            <w:tcMar>
-              <w:top w:w="70" w:type="dxa"/>
-              <w:start w:w="90" w:type="dxa"/>
-              <w:bottom w:w="70" w:type="dxa"/>
-              <w:end w:w="90" w:type="dxa"/>
-            </w:tcMar>
-          </w:tcPr>
-          <w:p>
-            <w:r>
-              <w:rPr>
-                <w:b/>
-              </w:rPr>
-              <w:t>Source Git blob</w:t>
-            </w:r>
-          </w:p>
-        </w:tc>
-        <w:tc>
-          <w:tcPr>
-            <w:tcW w:type="dxa" w:w="4997"/>
-            <w:tcMar>
-              <w:top w:w="70" w:type="dxa"/>
-              <w:start w:w="90" w:type="dxa"/>
-              <w:bottom w:w="70" w:type="dxa"/>
-              <w:end w:w="90" w:type="dxa"/>
-            </w:tcMar>
-          </w:tcPr>
-          <w:p>
-            <w:r>
-              <w:t>56f509189de369038258cca0f61ae0f59ddd4a04</w:t>
-            </w:r>
-          </w:p>
-        </w:tc>
-      </w:tr>
-      <w:tr>
-        <w:trPr>
-          <w:cantSplit/>
-        </w:trPr>
-        <w:tc>
-          <w:tcPr>
-            <w:tcW w:type="dxa" w:w="4997"/>
-            <w:shd w:fill="EAF2F8"/>
-            <w:tcMar>
-              <w:top w:w="70" w:type="dxa"/>
-              <w:start w:w="90" w:type="dxa"/>
-              <w:bottom w:w="70" w:type="dxa"/>
-              <w:end w:w="90" w:type="dxa"/>
-            </w:tcMar>
-          </w:tcPr>
-          <w:p>
-            <w:r>
-              <w:rPr>
-                <w:b/>
-              </w:rPr>
-              <w:t>Manual prepared</w:t>
-            </w:r>
-          </w:p>
-        </w:tc>
-        <w:tc>
-          <w:tcPr>
-            <w:tcW w:type="dxa" w:w="4997"/>
-            <w:tcMar>
-              <w:top w:w="70" w:type="dxa"/>
-              <w:start w:w="90" w:type="dxa"/>
-              <w:bottom w:w="70" w:type="dxa"/>
-              <w:end w:w="90" w:type="dxa"/>
-            </w:tcMar>
-          </w:tcPr>
-          <w:p>
-            <w:r>
-              <w:t>16 September 2026</w:t>
-            </w:r>
-          </w:p>
-        </w:tc>
-      </w:tr>
-    </w:tbl>
-    <w:p>
-      <w:pPr>
-        <w:spacing w:before="440"/>
-        <w:jc w:val="center"/>
-      </w:pPr>
-      <w:r>
-        <w:rPr>
-          <w:i/>
-          <w:sz w:val="18"/>
-        </w:rPr>
-        <w:t>Based on original work by Supratim Sanyal of SANYALnet Labs.</w:t>
-      </w:r>
-    </w:p>
-    <w:p>
-      <w:pPr>
-        <w:jc w:val="center"/>
-      </w:pPr>
-      <w:r>
-        <w:rPr>
-          <w:color w:val="5F5F5F"/>
-          <w:sz w:val="17"/>
-        </w:rPr>
-        <w:t>Derived from docs/01-ZX-UX-ARCHITECTURE-REV12.md.</w:t>
-      </w:r>
-    </w:p>
-    <w:p>
-      <w:r>
+        <w:drawing>
+          <wp:inline xmlns:a="http://schemas.openxmlformats.org/drawingml/2006/main" xmlns:pic="http://schemas.openxmlformats.org/drawingml/2006/picture">
+            <wp:extent cx="5806440" cy="8549640"/>
+            <wp:docPr id="1" name="Picture 1"/>
+            <wp:cNvGraphicFramePr>
+              <a:graphicFrameLocks noChangeAspect="1"/>
+            </wp:cNvGraphicFramePr>
+            <a:graphic>
+              <a:graphicData uri="http://schemas.openxmlformats.org/drawingml/2006/picture">
+                <pic:pic>
+                  <pic:nvPicPr>
+                    <pic:cNvPr id="0" name="cover-original.png"/>
+                    <pic:cNvPicPr/>
+                  </pic:nvPicPr>
+                  <pic:blipFill>
+                    <a:blip r:embed="rId13"/>
+                    <a:stretch>
+                      <a:fillRect/>
+                    </a:stretch>
+                  </pic:blipFill>
+                  <pic:spPr>
+                    <a:xfrm>
+                      <a:off x="0" y="0"/>
+                      <a:ext cx="5806440" cy="8549640"/>
+                    </a:xfrm>
+                    <a:prstGeom prst="rect"/>
+                  </pic:spPr>
+                </pic:pic>
+              </a:graphicData>
+            </a:graphic>
+          </wp:inline>
+        </w:drawing>
         <w:br w:type="page"/>
       </w:r>
     </w:p>

</xml_diff>